<commit_message>
Template manuscript: remove the "Use of AI assistance" section, as the course instructor asked
The text stays in content.py behind INCLUDE_AI_DISCLOSURE (False), so it can be restored if a venue requires it.
The main paper and docs/AI_USE_DISCLOSURE.md are unchanged.
</commit_message>
<xml_diff>
--- a/theory/template/STRATA_Theory_Manuscript.docx
+++ b/theory/template/STRATA_Theory_Manuscript.docx
@@ -27456,38 +27456,6 @@
           <w:lang w:val="en-US"/>
         </w:rPr>
         <w:t xml:space="preserve">The authors declare no competing interests.</w:t>
-      </w:r>
-    </w:p>
-    <w:p>
-      <w:pPr>
-        <w:keepNext/>
-        <w:spacing w:before="160" w:after="0" w:line="360" w:lineRule="auto"/>
-        <w:jc w:val="left"/>
-      </w:pPr>
-      <w:r>
-        <w:rPr>
-          <w:rFonts w:ascii="Times New Roman" w:hAnsi="Times New Roman" w:cs="Times New Roman"/>
-          <w:b/>
-          <w:sz w:val="24"/>
-          <w:szCs w:val="24"/>
-          <w:lang w:val="en-US"/>
-        </w:rPr>
-        <w:t xml:space="preserve">Use of AI assistance</w:t>
-      </w:r>
-    </w:p>
-    <w:p>
-      <w:pPr>
-        <w:spacing w:before="0" w:after="0" w:line="360" w:lineRule="auto"/>
-        <w:jc w:val="both"/>
-      </w:pPr>
-      <w:r>
-        <w:rPr>
-          <w:rFonts w:ascii="Times New Roman" w:hAnsi="Times New Roman" w:cs="Times New Roman"/>
-          <w:sz w:val="24"/>
-          <w:szCs w:val="24"/>
-          <w:lang w:val="en-US"/>
-        </w:rPr>
-        <w:t xml:space="preserve">The software, tests, benchmarks and the earlier empirical manuscript that this article extends were produced by an AI coding assistant working in the environment of the first author, under the authors' direction, as recorded in the repository. This article was developed with the same kind of tool: Anthropic's Claude (model Sonnet 5.5, through the Claude Code command-line tool) was used, at one author's direction, to review the earlier work adversarially, to propose and derive the theorems and proofs, to write the verification programs, to build the interactive page and to draft the text. Every number in the article is produced by those programs, which can be re-run. The tool is not an author; the listed authors are responsible for the content. The proofs are pen-and-paper and were checked by exhaustive and statistical programs, not by a proof assistant.</w:t>
       </w:r>
     </w:p>
     <w:p>

</xml_diff>